<commit_message>
Deploying to gh-pages from @ Morrison-Lab/ids@9e34a9d4068bba5ee1a1a0c32419a8c50317e1c0 🚀
</commit_message>
<xml_diff>
--- a/channel-capacity.docx
+++ b/channel-capacity.docx
@@ -15,7 +15,7 @@
         <w:pStyle w:val="Date"/>
       </w:pPr>
       <w:r>
-        <w:t xml:space="preserve">Last modified: 2026-10-24 19:16:36 (PDT)</w:t>
+        <w:t xml:space="preserve">Last modified: 2026-10-24 21:50:48 (PDT)</w:t>
       </w:r>
     </w:p>
     <w:p>
@@ -328,6 +328,7 @@
         <m:oMath>
           <m:r>
             <m:rPr>
+              <m:scr m:val="double-struck"/>
               <m:sty m:val="p"/>
             </m:rPr>
             <m:t>P</m:t>
@@ -1540,6 +1541,7 @@
       <m:oMath>
         <m:r>
           <m:rPr>
+            <m:scr m:val="double-struck"/>
             <m:sty m:val="p"/>
           </m:rPr>
           <m:t>P</m:t>
@@ -1594,6 +1596,7 @@
         </m:r>
         <m:r>
           <m:rPr>
+            <m:scr m:val="double-struck"/>
             <m:sty m:val="p"/>
           </m:rPr>
           <m:t>P</m:t>
@@ -1783,6 +1786,7 @@
             <m:lim>
               <m:r>
                 <m:rPr>
+                  <m:scr m:val="double-struck"/>
                   <m:sty m:val="p"/>
                 </m:rPr>
                 <m:t>P</m:t>
@@ -3398,6 +3402,7 @@
             <m:e>
               <m:r>
                 <m:rPr>
+                  <m:scr m:val="double-struck"/>
                   <m:sty m:val="p"/>
                 </m:rPr>
                 <m:t>P</m:t>
@@ -3437,6 +3442,7 @@
               </m:r>
               <m:r>
                 <m:rPr>
+                  <m:scr m:val="double-struck"/>
                   <m:sty m:val="p"/>
                 </m:rPr>
                 <m:t>P</m:t>
@@ -3479,6 +3485,7 @@
               </m:r>
               <m:r>
                 <m:rPr>
+                  <m:scr m:val="double-struck"/>
                   <m:sty m:val="p"/>
                 </m:rPr>
                 <m:t>P</m:t>
@@ -4360,6 +4367,7 @@
         </m:limUpp>
         <m:r>
           <m:rPr>
+            <m:scr m:val="double-struck"/>
             <m:sty m:val="p"/>
           </m:rPr>
           <m:t>P</m:t>
@@ -5846,6 +5854,7 @@
       <m:oMath>
         <m:r>
           <m:rPr>
+            <m:scr m:val="double-struck"/>
             <m:sty m:val="p"/>
           </m:rPr>
           <m:t>P</m:t>
@@ -5900,6 +5909,7 @@
         </m:r>
         <m:r>
           <m:rPr>
+            <m:scr m:val="double-struck"/>
             <m:sty m:val="p"/>
           </m:rPr>
           <m:t>P</m:t>
@@ -6086,6 +6096,7 @@
               </m:r>
               <m:r>
                 <m:rPr>
+                  <m:scr m:val="double-struck"/>
                   <m:sty m:val="p"/>
                 </m:rPr>
                 <m:t>P</m:t>
@@ -6161,6 +6172,7 @@
               </m:r>
               <m:r>
                 <m:rPr>
+                  <m:scr m:val="double-struck"/>
                   <m:sty m:val="p"/>
                 </m:rPr>
                 <m:t>P</m:t>

</xml_diff>

<commit_message>
Deploying to gh-pages from @ Morrison-Lab/ids@e3f011e538e55781ae2c4d6273611c2de7c5abda 🚀
</commit_message>
<xml_diff>
--- a/channel-capacity.docx
+++ b/channel-capacity.docx
@@ -15,7 +15,7 @@
         <w:pStyle w:val="Date"/>
       </w:pPr>
       <w:r>
-        <w:t xml:space="preserve">Last modified: 2026-10-26 09:06:27 (PDT)</w:t>
+        <w:t xml:space="preserve">Last modified: 2026-10-26 16:12:37 (PDT)</w:t>
       </w:r>
     </w:p>
     <w:p>
@@ -1419,7 +1419,7 @@
     </w:p>
     <w:bookmarkEnd w:id="13"/>
     <w:bookmarkEnd w:id="14"/>
-    <w:bookmarkStart w:id="29" w:name="sec-channel-capacity"/>
+    <w:bookmarkStart w:id="30" w:name="sec-channel-capacity"/>
     <w:p>
       <w:pPr>
         <w:pStyle w:val="Heading2"/>
@@ -1428,7 +1428,7 @@
         <w:t xml:space="preserve">2 Capacity</w:t>
       </w:r>
     </w:p>
-    <w:bookmarkStart w:id="16" w:name="def-channel-capacity"/>
+    <w:bookmarkStart w:id="17" w:name="def-channel-capacity"/>
     <w:p>
       <w:pPr>
         <w:pStyle w:val="FirstParagraph"/>
@@ -1907,19 +1907,23 @@
       <w:r>
         <w:t xml:space="preserve"> </w:t>
       </w:r>
-      <w:r>
-        <w:rPr>
-          <w:i/>
-          <w:iCs/>
-        </w:rPr>
-        <w:t xml:space="preserve">bits per channel use</w:t>
-      </w:r>
-      <w:r>
-        <w:t xml:space="preserve">.</w:t>
+      <w:hyperlink r:id="rId16">
+        <w:r>
+          <w:rPr>
+            <w:rStyle w:val="Hyperlink"/>
+          </w:rPr>
+          <w:t xml:space="preserve">bits</w:t>
+        </w:r>
+      </w:hyperlink>
+      <w:r>
+        <w:t xml:space="preserve"> </w:t>
+      </w:r>
+      <w:r>
+        <w:t xml:space="preserve">per channel use.</w:t>
       </w:r>
     </w:p>
-    <w:bookmarkEnd w:id="16"/>
-    <w:bookmarkStart w:id="18" w:name="rem-capacity-meaning"/>
+    <w:bookmarkEnd w:id="17"/>
+    <w:bookmarkStart w:id="19" w:name="rem-capacity-meaning"/>
     <w:p>
       <w:pPr>
         <w:pStyle w:val="BodyText"/>
@@ -2026,7 +2030,7 @@
       <w:r>
         <w:t xml:space="preserve">(</w:t>
       </w:r>
-      <w:hyperlink r:id="rId17">
+      <w:hyperlink r:id="rId18">
         <w:r>
           <w:rPr>
             <w:rStyle w:val="Hyperlink"/>
@@ -2112,8 +2116,8 @@
         <w:t xml:space="preserve">how often to send each input as well as possible.</w:t>
       </w:r>
     </w:p>
-    <w:bookmarkEnd w:id="18"/>
-    <w:bookmarkStart w:id="19" w:name="def-binary-entropy"/>
+    <w:bookmarkEnd w:id="19"/>
+    <w:bookmarkStart w:id="20" w:name="def-binary-entropy"/>
     <w:p>
       <w:pPr>
         <w:pStyle w:val="BodyText"/>
@@ -2402,8 +2406,8 @@
         <w:t xml:space="preserve">.</w:t>
       </w:r>
     </w:p>
-    <w:bookmarkEnd w:id="19"/>
-    <w:bookmarkStart w:id="21" w:name="rem-binary-entropy"/>
+    <w:bookmarkEnd w:id="20"/>
+    <w:bookmarkStart w:id="22" w:name="rem-binary-entropy"/>
     <w:p>
       <w:pPr>
         <w:pStyle w:val="BodyText"/>
@@ -2447,7 +2451,7 @@
       <w:r>
         <w:t xml:space="preserve"> </w:t>
       </w:r>
-      <w:hyperlink r:id="rId20">
+      <w:hyperlink r:id="rId21">
         <w:r>
           <w:rPr>
             <w:rStyle w:val="Hyperlink"/>
@@ -2545,8 +2549,8 @@
         <w:t xml:space="preserve">.</w:t>
       </w:r>
     </w:p>
-    <w:bookmarkEnd w:id="21"/>
-    <w:bookmarkStart w:id="22" w:name="thm-bsc-capacity"/>
+    <w:bookmarkEnd w:id="22"/>
+    <w:bookmarkStart w:id="23" w:name="thm-bsc-capacity"/>
     <w:p>
       <w:pPr>
         <w:pStyle w:val="BodyText"/>
@@ -2699,7 +2703,7 @@
         <w:t xml:space="preserve">A uniformly distributed input achieves it.</w:t>
       </w:r>
     </w:p>
-    <w:bookmarkEnd w:id="22"/>
+    <w:bookmarkEnd w:id="23"/>
     <w:p>
       <w:pPr>
         <w:pStyle w:val="BodyText"/>
@@ -2924,7 +2928,7 @@
       <w:r>
         <w:t xml:space="preserve"> </w:t>
       </w:r>
-      <w:hyperlink r:id="rId23">
+      <w:hyperlink r:id="rId24">
         <w:r>
           <w:rPr>
             <w:rStyle w:val="Hyperlink"/>
@@ -3030,7 +3034,7 @@
       <w:r>
         <w:t xml:space="preserve"> </w:t>
       </w:r>
-      <w:hyperlink r:id="rId24">
+      <w:hyperlink r:id="rId25">
         <w:r>
           <w:rPr>
             <w:rStyle w:val="Hyperlink"/>
@@ -3783,7 +3787,7 @@
         <w:t xml:space="preserve">.</w:t>
       </w:r>
     </w:p>
-    <w:bookmarkStart w:id="25" w:name="exm-bsc-capacity"/>
+    <w:bookmarkStart w:id="26" w:name="exm-bsc-capacity"/>
     <w:p>
       <w:pPr>
         <w:pStyle w:val="BodyText"/>
@@ -4243,8 +4247,8 @@
         <w:t xml:space="preserve">since the receiver can flip every bit back.</w:t>
       </w:r>
     </w:p>
-    <w:bookmarkEnd w:id="25"/>
-    <w:bookmarkStart w:id="27" w:name="exr-bec-capacity"/>
+    <w:bookmarkEnd w:id="26"/>
+    <w:bookmarkStart w:id="28" w:name="exr-bec-capacity"/>
     <w:p>
       <w:pPr>
         <w:pStyle w:val="BodyText"/>
@@ -4613,7 +4617,7 @@
       <w:r>
         <w:t xml:space="preserve"> </w:t>
       </w:r>
-      <w:hyperlink r:id="rId26">
+      <w:hyperlink r:id="rId27">
         <w:r>
           <w:rPr>
             <w:rStyle w:val="Hyperlink"/>
@@ -4869,8 +4873,8 @@
         <w:t xml:space="preserve">bits per channel use.</w:t>
       </w:r>
     </w:p>
-    <w:bookmarkEnd w:id="27"/>
-    <w:bookmarkStart w:id="28" w:name="sol-bec-capacity"/>
+    <w:bookmarkEnd w:id="28"/>
+    <w:bookmarkStart w:id="29" w:name="sol-bec-capacity"/>
     <w:p>
       <w:pPr>
         <w:pStyle w:val="FirstParagraph"/>
@@ -6857,9 +6861,9 @@
         <w:t xml:space="preserve">reach the same capacity.</w:t>
       </w:r>
     </w:p>
-    <w:bookmarkEnd w:id="28"/>
     <w:bookmarkEnd w:id="29"/>
-    <w:bookmarkStart w:id="34" w:name="sec-channel-coding-theorem"/>
+    <w:bookmarkEnd w:id="30"/>
+    <w:bookmarkStart w:id="35" w:name="sec-channel-coding-theorem"/>
     <w:p>
       <w:pPr>
         <w:pStyle w:val="Heading2"/>
@@ -6868,7 +6872,7 @@
         <w:t xml:space="preserve">3 The noisy-channel coding theorem</w:t>
       </w:r>
     </w:p>
-    <w:bookmarkStart w:id="30" w:name="def-channel-code"/>
+    <w:bookmarkStart w:id="31" w:name="def-channel-code"/>
     <w:p>
       <w:pPr>
         <w:pStyle w:val="FirstParagraph"/>
@@ -7444,8 +7448,8 @@
         <w:t xml:space="preserve">.</w:t>
       </w:r>
     </w:p>
-    <w:bookmarkEnd w:id="30"/>
-    <w:bookmarkStart w:id="31" w:name="exm-repetition-code"/>
+    <w:bookmarkEnd w:id="31"/>
+    <w:bookmarkStart w:id="32" w:name="exm-repetition-code"/>
     <w:p>
       <w:pPr>
         <w:pStyle w:val="BodyText"/>
@@ -7836,8 +7840,8 @@
         <w:t xml:space="preserve">works through this code.</w:t>
       </w:r>
     </w:p>
-    <w:bookmarkEnd w:id="31"/>
-    <w:bookmarkStart w:id="32" w:name="thm-channel-coding"/>
+    <w:bookmarkEnd w:id="32"/>
+    <w:bookmarkStart w:id="33" w:name="thm-channel-coding"/>
     <w:p>
       <w:pPr>
         <w:pStyle w:val="BodyText"/>
@@ -8241,8 +8245,8 @@
         <w:t xml:space="preserve">.</w:t>
       </w:r>
     </w:p>
-    <w:bookmarkEnd w:id="32"/>
-    <w:bookmarkStart w:id="33" w:name="rem-channel-coding-meaning"/>
+    <w:bookmarkEnd w:id="33"/>
+    <w:bookmarkStart w:id="34" w:name="rem-channel-coding-meaning"/>
     <w:p>
       <w:pPr>
         <w:pStyle w:val="FirstParagraph"/>
@@ -8428,9 +8432,9 @@
         <w:t xml:space="preserve">gives another account.</w:t>
       </w:r>
     </w:p>
-    <w:bookmarkEnd w:id="33"/>
     <w:bookmarkEnd w:id="34"/>
-    <w:bookmarkStart w:id="41" w:name="references"/>
+    <w:bookmarkEnd w:id="35"/>
+    <w:bookmarkStart w:id="42" w:name="references"/>
     <w:p>
       <w:pPr>
         <w:pStyle w:val="Heading2"/>
@@ -8439,8 +8443,8 @@
         <w:t xml:space="preserve">References</w:t>
       </w:r>
     </w:p>
-    <w:bookmarkStart w:id="40" w:name="refs"/>
-    <w:bookmarkStart w:id="36" w:name="ref-cover2006elements"/>
+    <w:bookmarkStart w:id="41" w:name="refs"/>
+    <w:bookmarkStart w:id="37" w:name="ref-cover2006elements"/>
     <w:p>
       <w:pPr>
         <w:pStyle w:val="Bibliography"/>
@@ -8464,7 +8468,7 @@
       <w:r>
         <w:t xml:space="preserve"> </w:t>
       </w:r>
-      <w:hyperlink r:id="rId35">
+      <w:hyperlink r:id="rId36">
         <w:r>
           <w:rPr>
             <w:rStyle w:val="Hyperlink"/>
@@ -8476,8 +8480,8 @@
         <w:t xml:space="preserve">.</w:t>
       </w:r>
     </w:p>
-    <w:bookmarkEnd w:id="36"/>
-    <w:bookmarkStart w:id="37" w:name="ref-mackay2003information"/>
+    <w:bookmarkEnd w:id="37"/>
+    <w:bookmarkStart w:id="38" w:name="ref-mackay2003information"/>
     <w:p>
       <w:pPr>
         <w:pStyle w:val="Bibliography"/>
@@ -8499,8 +8503,8 @@
         <w:t xml:space="preserve">. Cambridge University Press.</w:t>
       </w:r>
     </w:p>
-    <w:bookmarkEnd w:id="37"/>
-    <w:bookmarkStart w:id="39" w:name="ref-shannon1948mathematical"/>
+    <w:bookmarkEnd w:id="38"/>
+    <w:bookmarkStart w:id="40" w:name="ref-shannon1948mathematical"/>
     <w:p>
       <w:pPr>
         <w:pStyle w:val="Bibliography"/>
@@ -8533,7 +8537,7 @@
       <w:r>
         <w:t xml:space="preserve"> </w:t>
       </w:r>
-      <w:hyperlink r:id="rId38">
+      <w:hyperlink r:id="rId39">
         <w:r>
           <w:rPr>
             <w:rStyle w:val="Hyperlink"/>
@@ -8545,9 +8549,9 @@
         <w:t xml:space="preserve">.</w:t>
       </w:r>
     </w:p>
-    <w:bookmarkEnd w:id="39"/>
     <w:bookmarkEnd w:id="40"/>
     <w:bookmarkEnd w:id="41"/>
+    <w:bookmarkEnd w:id="42"/>
     <w:sectPr>
       <w:footnotePr>
         <w:numRestart w:val="eachSect"/>

</xml_diff>